<commit_message>
Initial commit and first draft
</commit_message>
<xml_diff>
--- a/docs/documentation/methods/monetary-valuation/index.docx
+++ b/docs/documentation/methods/monetary-valuation/index.docx
@@ -44,7 +44,7 @@
         </w:p>
       </w:sdtContent>
     </w:sdt>
-    <w:bookmarkStart w:id="16" w:name="introduction"/>
+    <w:bookmarkStart w:id="18" w:name="introduction"/>
     <w:p>
       <w:pPr>
         <w:pStyle w:val="Heading1"/>
@@ -312,6 +312,333 @@
       </w:r>
       <w:r>
         <w:t xml:space="preserve">, so both documents stay consistent.</w:t>
+      </w:r>
+    </w:p>
+    <w:bookmarkStart w:id="10" w:name="key-terms"/>
+    <w:p>
+      <w:pPr>
+        <w:pStyle w:val="Heading2"/>
+      </w:pPr>
+      <w:r>
+        <w:t xml:space="preserve">Key terms</w:t>
+      </w:r>
+    </w:p>
+    <w:tbl>
+      <w:tblPr>
+        <w:tblStyle w:val="Table"/>
+        <w:tblW w:type="pct" w:w="5000"/>
+        <w:tblLayout w:type="fixed"/>
+        <w:tblLook w:firstRow="1" w:lastRow="0" w:firstColumn="0" w:lastColumn="0" w:noHBand="0" w:noVBand="0" w:val="0020"/>
+      </w:tblPr>
+      <w:tblGrid>
+        <w:gridCol w:w="3960"/>
+        <w:gridCol w:w="3960"/>
+      </w:tblGrid>
+      <w:tr>
+        <w:trPr>
+          <w:tblHeader w:val="on"/>
+        </w:trPr>
+        <w:tc>
+          <w:tcPr/>
+          <w:p>
+            <w:pPr>
+              <w:pStyle w:val="Compact"/>
+            </w:pPr>
+            <w:r>
+              <w:t xml:space="preserve">Term</w:t>
+            </w:r>
+          </w:p>
+        </w:tc>
+        <w:tc>
+          <w:tcPr/>
+          <w:p>
+            <w:pPr>
+              <w:pStyle w:val="Compact"/>
+            </w:pPr>
+            <w:r>
+              <w:t xml:space="preserve">Meaning in this document</w:t>
+            </w:r>
+          </w:p>
+        </w:tc>
+      </w:tr>
+      <w:tr>
+        <w:tc>
+          <w:tcPr/>
+          <w:p>
+            <w:pPr>
+              <w:pStyle w:val="Compact"/>
+            </w:pPr>
+            <w:r>
+              <w:t xml:space="preserve">Monetary value of the service</w:t>
+            </w:r>
+          </w:p>
+        </w:tc>
+        <w:tc>
+          <w:tcPr/>
+          <w:p>
+            <w:pPr>
+              <w:pStyle w:val="Compact"/>
+            </w:pPr>
+            <w:r>
+              <w:t xml:space="preserve">The value of the wood that the forest grows in a year, which is the net annual increment (NAI) times a price per cubic metre.</w:t>
+            </w:r>
+          </w:p>
+        </w:tc>
+      </w:tr>
+      <w:tr>
+        <w:tc>
+          <w:tcPr/>
+          <w:p>
+            <w:pPr>
+              <w:pStyle w:val="Compact"/>
+            </w:pPr>
+            <w:r>
+              <w:t xml:space="preserve">Unit value</w:t>
+            </w:r>
+          </w:p>
+        </w:tc>
+        <w:tc>
+          <w:tcPr/>
+          <w:p>
+            <w:pPr>
+              <w:pStyle w:val="Compact"/>
+            </w:pPr>
+            <w:r>
+              <w:t xml:space="preserve">A value divided by a volume, here euro per cubic metre.</w:t>
+            </w:r>
+          </w:p>
+        </w:tc>
+      </w:tr>
+      <w:tr>
+        <w:tc>
+          <w:tcPr/>
+          <w:p>
+            <w:pPr>
+              <w:pStyle w:val="Compact"/>
+            </w:pPr>
+            <w:r>
+              <w:t xml:space="preserve">Standing timber</w:t>
+            </w:r>
+          </w:p>
+        </w:tc>
+        <w:tc>
+          <w:tcPr/>
+          <w:p>
+            <w:pPr>
+              <w:pStyle w:val="Compact"/>
+            </w:pPr>
+            <w:r>
+              <w:t xml:space="preserve">Trees as they stand in the forest, before harvest. Its value is what the wood is worth before the costs of felling and transport.</w:t>
+            </w:r>
+          </w:p>
+        </w:tc>
+      </w:tr>
+      <w:tr>
+        <w:tc>
+          <w:tcPr/>
+          <w:p>
+            <w:pPr>
+              <w:pStyle w:val="Compact"/>
+            </w:pPr>
+            <w:r>
+              <w:t xml:space="preserve">Output of forest trees (</w:t>
+            </w:r>
+            <w:r>
+              <w:rPr>
+                <w:rStyle w:val="VerbatimChar"/>
+              </w:rPr>
+              <w:t xml:space="preserve">P1_TR</w:t>
+            </w:r>
+            <w:r>
+              <w:t xml:space="preserve">)</w:t>
+            </w:r>
+          </w:p>
+        </w:tc>
+        <w:tc>
+          <w:tcPr/>
+          <w:p>
+            <w:pPr>
+              <w:pStyle w:val="Compact"/>
+            </w:pPr>
+            <w:r>
+              <w:t xml:space="preserve">The item of the Eurostat forestry accounts that records the value of standing timber produced in a year.</w:t>
+            </w:r>
+          </w:p>
+        </w:tc>
+      </w:tr>
+      <w:tr>
+        <w:tc>
+          <w:tcPr/>
+          <w:p>
+            <w:pPr>
+              <w:pStyle w:val="Compact"/>
+            </w:pPr>
+            <w:r>
+              <w:t xml:space="preserve">Roundwood</w:t>
+            </w:r>
+          </w:p>
+        </w:tc>
+        <w:tc>
+          <w:tcPr/>
+          <w:p>
+            <w:pPr>
+              <w:pStyle w:val="Compact"/>
+            </w:pPr>
+            <w:r>
+              <w:t xml:space="preserve">Felled and cut timber, not yet processed. Its export price includes harvesting and transport, so it is higher than the value of standing timber.</w:t>
+            </w:r>
+          </w:p>
+        </w:tc>
+      </w:tr>
+      <w:tr>
+        <w:tc>
+          <w:tcPr/>
+          <w:p>
+            <w:pPr>
+              <w:pStyle w:val="Compact"/>
+            </w:pPr>
+            <w:r>
+              <w:t xml:space="preserve">Current prices</w:t>
+            </w:r>
+          </w:p>
+        </w:tc>
+        <w:tc>
+          <w:tcPr/>
+          <w:p>
+            <w:pPr>
+              <w:pStyle w:val="Compact"/>
+            </w:pPr>
+            <w:r>
+              <w:t xml:space="preserve">Values in the money of the year in which they occurred. Inflation makes them hard to compare across years.</w:t>
+            </w:r>
+          </w:p>
+        </w:tc>
+      </w:tr>
+      <w:tr>
+        <w:tc>
+          <w:tcPr/>
+          <w:p>
+            <w:pPr>
+              <w:pStyle w:val="Compact"/>
+            </w:pPr>
+            <w:r>
+              <w:t xml:space="preserve">Constant prices</w:t>
+            </w:r>
+          </w:p>
+        </w:tc>
+        <w:tc>
+          <w:tcPr/>
+          <w:p>
+            <w:pPr>
+              <w:pStyle w:val="Compact"/>
+            </w:pPr>
+            <w:r>
+              <w:t xml:space="preserve">Values converted to the prices of one base year, so that changes over time reflect quantities and not inflation.</w:t>
+            </w:r>
+          </w:p>
+        </w:tc>
+      </w:tr>
+      <w:tr>
+        <w:tc>
+          <w:tcPr/>
+          <w:p>
+            <w:pPr>
+              <w:pStyle w:val="Compact"/>
+            </w:pPr>
+            <w:r>
+              <w:t xml:space="preserve">Deflator</w:t>
+            </w:r>
+          </w:p>
+        </w:tc>
+        <w:tc>
+          <w:tcPr/>
+          <w:p>
+            <w:pPr>
+              <w:pStyle w:val="Compact"/>
+            </w:pPr>
+            <w:r>
+              <w:t xml:space="preserve">The factor that converts a current value to constant prices. It is the price index of the base year divided by the index of the year of the value.</w:t>
+            </w:r>
+          </w:p>
+        </w:tc>
+      </w:tr>
+      <w:tr>
+        <w:tc>
+          <w:tcPr/>
+          <w:p>
+            <w:pPr>
+              <w:pStyle w:val="Compact"/>
+            </w:pPr>
+            <w:r>
+              <w:t xml:space="preserve">HICP</w:t>
+            </w:r>
+          </w:p>
+        </w:tc>
+        <w:tc>
+          <w:tcPr/>
+          <w:p>
+            <w:pPr>
+              <w:pStyle w:val="Compact"/>
+            </w:pPr>
+            <w:r>
+              <w:t xml:space="preserve">The Harmonised Index of Consumer Prices of Eurostat, used here as the general price index.</w:t>
+            </w:r>
+          </w:p>
+        </w:tc>
+      </w:tr>
+    </w:tbl>
+    <w:bookmarkEnd w:id="10"/>
+    <w:bookmarkStart w:id="17" w:name="why-the-method-uses-two-prices"/>
+    <w:p>
+      <w:pPr>
+        <w:pStyle w:val="Heading2"/>
+      </w:pPr>
+      <w:r>
+        <w:t xml:space="preserve">Why the method uses two prices</w:t>
+      </w:r>
+    </w:p>
+    <w:p>
+      <w:pPr>
+        <w:pStyle w:val="FirstParagraph"/>
+      </w:pPr>
+      <w:r>
+        <w:t xml:space="preserve">The value of standing timber is the ideal price for the service, but countries rarely report it,</w:t>
+      </w:r>
+      <w:r>
+        <w:t xml:space="preserve"> </w:t>
+      </w:r>
+      <w:r>
+        <w:t xml:space="preserve">mainly before 2012. Roundwood export prices are reported by almost every country and year, but they</w:t>
+      </w:r>
+      <w:r>
+        <w:t xml:space="preserve"> </w:t>
+      </w:r>
+      <w:r>
+        <w:t xml:space="preserve">include the costs of harvesting and transport, so they are not the same thing. The method uses</w:t>
+      </w:r>
+      <w:r>
+        <w:t xml:space="preserve"> </w:t>
+      </w:r>
+      <w:r>
+        <w:t xml:space="preserve">the countries and years where both prices exist to measure how far apart the two are (the</w:t>
+      </w:r>
+      <w:r>
+        <w:t xml:space="preserve"> </w:t>
+      </w:r>
+      <w:r>
+        <w:t xml:space="preserve">ratio). It then turns the well-covered export price into an estimate of the timber price by dividing</w:t>
+      </w:r>
+      <w:r>
+        <w:t xml:space="preserve"> </w:t>
+      </w:r>
+      <w:r>
+        <w:t xml:space="preserve">by that ratio. In the years and countries with no timber price, the ratio is replaced by an</w:t>
+      </w:r>
+      <w:r>
+        <w:t xml:space="preserve"> </w:t>
+      </w:r>
+      <w:r>
+        <w:t xml:space="preserve">average, which is the weakest part of the method and is reported openly in the tables below.</w:t>
       </w:r>
     </w:p>
     <w:tbl>
@@ -355,18 +682,18 @@
                 <wp:inline>
                   <wp:extent cx="152400" cy="152400"/>
                   <wp:effectExtent b="0" l="0" r="0" t="0"/>
-                  <wp:docPr descr="" title="" id="11" name="Picture"/>
+                  <wp:docPr descr="" title="" id="12" name="Picture"/>
                   <a:graphic>
                     <a:graphicData uri="http://schemas.openxmlformats.org/drawingml/2006/picture">
                       <pic:pic>
                         <pic:nvPicPr>
-                          <pic:cNvPr descr="/Applications/quarto/share/formats/docx/important.png" id="12" name="Picture"/>
+                          <pic:cNvPr descr="/Applications/quarto/share/formats/docx/important.png" id="13" name="Picture"/>
                           <pic:cNvPicPr>
                             <a:picLocks noChangeArrowheads="1" noChangeAspect="1"/>
                           </pic:cNvPicPr>
                         </pic:nvPicPr>
                         <pic:blipFill>
-                          <a:blip r:embed="rId10"/>
+                          <a:blip r:embed="rId11"/>
                           <a:stretch>
                             <a:fillRect/>
                           </a:stretch>
@@ -518,18 +845,18 @@
                 <wp:inline>
                   <wp:extent cx="152400" cy="152400"/>
                   <wp:effectExtent b="0" l="0" r="0" t="0"/>
-                  <wp:docPr descr="" title="" id="14" name="Picture"/>
+                  <wp:docPr descr="" title="" id="15" name="Picture"/>
                   <a:graphic>
                     <a:graphicData uri="http://schemas.openxmlformats.org/drawingml/2006/picture">
                       <pic:pic>
                         <pic:nvPicPr>
-                          <pic:cNvPr descr="/Applications/quarto/share/formats/docx/note.png" id="15" name="Picture"/>
+                          <pic:cNvPr descr="/Applications/quarto/share/formats/docx/note.png" id="16" name="Picture"/>
                           <pic:cNvPicPr>
                             <a:picLocks noChangeArrowheads="1" noChangeAspect="1"/>
                           </pic:cNvPicPr>
                         </pic:nvPicPr>
                         <pic:blipFill>
-                          <a:blip r:embed="rId13"/>
+                          <a:blip r:embed="rId14"/>
                           <a:stretch>
                             <a:fillRect/>
                           </a:stretch>
@@ -607,7 +934,13 @@
               <w:t xml:space="preserve"> </w:t>
             </w:r>
             <w:r>
-              <w:t xml:space="preserve">accounts, so that the services share one price level (the INCA plugin uses 2000). Changing it does not touch the nominal</w:t>
+              <w:t xml:space="preserve">accounts, so that the services share one price level and can be added or compared (the INCA plugin</w:t>
+            </w:r>
+            <w:r>
+              <w:t xml:space="preserve"> </w:t>
+            </w:r>
+            <w:r>
+              <w:t xml:space="preserve">uses 2000). The choice of base year changes the level of the constant-price series but not its shape. Changing it does not touch the nominal</w:t>
             </w:r>
             <w:r>
               <w:t xml:space="preserve"> </w:t>
@@ -620,8 +953,9 @@
         </w:tc>
       </w:tr>
     </w:tbl>
-    <w:bookmarkEnd w:id="16"/>
-    <w:bookmarkStart w:id="20" w:name="preliminaries"/>
+    <w:bookmarkEnd w:id="17"/>
+    <w:bookmarkEnd w:id="18"/>
+    <w:bookmarkStart w:id="22" w:name="preliminaries"/>
     <w:p>
       <w:pPr>
         <w:pStyle w:val="Heading1"/>
@@ -630,7 +964,7 @@
         <w:t xml:space="preserve">Preliminaries</w:t>
       </w:r>
     </w:p>
-    <w:bookmarkStart w:id="17" w:name="packages-and-helper-functions"/>
+    <w:bookmarkStart w:id="19" w:name="packages-and-helper-functions"/>
     <w:p>
       <w:pPr>
         <w:pStyle w:val="Heading2"/>
@@ -836,8 +1170,8 @@
         <w:t xml:space="preserve">)</w:t>
       </w:r>
     </w:p>
-    <w:bookmarkEnd w:id="17"/>
-    <w:bookmarkStart w:id="18" w:name="parameters"/>
+    <w:bookmarkEnd w:id="19"/>
+    <w:bookmarkStart w:id="20" w:name="parameters"/>
     <w:p>
       <w:pPr>
         <w:pStyle w:val="Heading2"/>
@@ -851,13 +1185,31 @@
         <w:pStyle w:val="FirstParagraph"/>
       </w:pPr>
       <w:r>
-        <w:t xml:space="preserve">The averages that complete the gaps use the same windows as the INCA plugin: the country mean over</w:t>
-      </w:r>
-      <w:r>
-        <w:t xml:space="preserve"> </w:t>
-      </w:r>
-      <w:r>
-        <w:t xml:space="preserve">the whole series, and the EU mean over the more recent years, where coverage is better. The</w:t>
+        <w:t xml:space="preserve">A country with some observations is completed with its own average, because its price level is</w:t>
+      </w:r>
+      <w:r>
+        <w:t xml:space="preserve"> </w:t>
+      </w:r>
+      <w:r>
+        <w:t xml:space="preserve">the best guide to its missing years. A country with no observations at all is completed with the</w:t>
+      </w:r>
+      <w:r>
+        <w:t xml:space="preserve"> </w:t>
+      </w:r>
+      <w:r>
+        <w:t xml:space="preserve">EU average, taken over recent years, where coverage is better. The averages that complete the gaps</w:t>
+      </w:r>
+      <w:r>
+        <w:t xml:space="preserve"> </w:t>
+      </w:r>
+      <w:r>
+        <w:t xml:space="preserve">use the same windows as the INCA plugin: the country mean over the whole series, and the EU mean over</w:t>
+      </w:r>
+      <w:r>
+        <w:t xml:space="preserve"> </w:t>
+      </w:r>
+      <w:r>
+        <w:t xml:space="preserve">the more recent years. The</w:t>
       </w:r>
       <w:r>
         <w:t xml:space="preserve"> </w:t>
@@ -1489,8 +1841,8 @@
         <w:t xml:space="preserve">)</w:t>
       </w:r>
     </w:p>
-    <w:bookmarkEnd w:id="18"/>
-    <w:bookmarkStart w:id="19" w:name="preparing-the-eurostat-inputs"/>
+    <w:bookmarkEnd w:id="20"/>
+    <w:bookmarkStart w:id="21" w:name="preparing-the-eurostat-inputs"/>
     <w:p>
       <w:pPr>
         <w:pStyle w:val="Heading2"/>
@@ -1593,9 +1945,9 @@
         <w:t xml:space="preserve">)</w:t>
       </w:r>
     </w:p>
-    <w:bookmarkEnd w:id="19"/>
-    <w:bookmarkEnd w:id="20"/>
-    <w:bookmarkStart w:id="22" w:name="loading-the-inputs"/>
+    <w:bookmarkEnd w:id="21"/>
+    <w:bookmarkEnd w:id="22"/>
+    <w:bookmarkStart w:id="24" w:name="loading-the-inputs"/>
     <w:p>
       <w:pPr>
         <w:pStyle w:val="Heading1"/>
@@ -1944,7 +2296,7 @@
         <w:t xml:space="preserve">(hicp_file)</w:t>
       </w:r>
     </w:p>
-    <w:bookmarkStart w:id="21" w:name="how-much-was-reported"/>
+    <w:bookmarkStart w:id="23" w:name="how-much-was-reported"/>
     <w:p>
       <w:pPr>
         <w:pStyle w:val="Heading2"/>
@@ -3398,9 +3750,9 @@
         <w:t xml:space="preserve">in the early years.</w:t>
       </w:r>
     </w:p>
-    <w:bookmarkEnd w:id="21"/>
-    <w:bookmarkEnd w:id="22"/>
-    <w:bookmarkStart w:id="30" w:name="unit-values"/>
+    <w:bookmarkEnd w:id="23"/>
+    <w:bookmarkEnd w:id="24"/>
+    <w:bookmarkStart w:id="32" w:name="unit-values"/>
     <w:p>
       <w:pPr>
         <w:pStyle w:val="Heading1"/>
@@ -3409,7 +3761,7 @@
         <w:t xml:space="preserve">Unit values</w:t>
       </w:r>
     </w:p>
-    <w:bookmarkStart w:id="23" w:name="unit-value-of-nai"/>
+    <w:bookmarkStart w:id="25" w:name="unit-value-of-nai"/>
     <w:p>
       <w:pPr>
         <w:pStyle w:val="Heading2"/>
@@ -3755,8 +4107,8 @@
         <w:t xml:space="preserve">(geo, year, value)</w:t>
       </w:r>
     </w:p>
-    <w:bookmarkEnd w:id="23"/>
-    <w:bookmarkStart w:id="24" w:name="unit-value-of-roundwood-exports"/>
+    <w:bookmarkEnd w:id="25"/>
+    <w:bookmarkStart w:id="26" w:name="unit-value-of-roundwood-exports"/>
     <w:p>
       <w:pPr>
         <w:pStyle w:val="Heading2"/>
@@ -3976,8 +4328,8 @@
         <w:t xml:space="preserve">(unit_value_exports, country_years, eu_years)</w:t>
       </w:r>
     </w:p>
-    <w:bookmarkEnd w:id="24"/>
-    <w:bookmarkStart w:id="25" w:name="ratio-of-export-price-to-timber-price"/>
+    <w:bookmarkEnd w:id="26"/>
+    <w:bookmarkStart w:id="27" w:name="ratio-of-export-price-to-timber-price"/>
     <w:p>
       <w:pPr>
         <w:pStyle w:val="Heading2"/>
@@ -3991,13 +4343,31 @@
         <w:pStyle w:val="FirstParagraph"/>
       </w:pPr>
       <w:r>
-        <w:t xml:space="preserve">The ratio is computed from the reported values only, before any filling. Infinite values, which come</w:t>
-      </w:r>
-      <w:r>
-        <w:t xml:space="preserve"> </w:t>
-      </w:r>
-      <w:r>
-        <w:t xml:space="preserve">from a zero timber value, are treated as missing. The gaps are then filled with the same averages.</w:t>
+        <w:t xml:space="preserve">The ratio is the export unit value divided by the timber unit value. A ratio of 3 means that</w:t>
+      </w:r>
+      <w:r>
+        <w:t xml:space="preserve"> </w:t>
+      </w:r>
+      <w:r>
+        <w:t xml:space="preserve">roundwood sells for three times the value of the same wood standing. It is computed from the</w:t>
+      </w:r>
+      <w:r>
+        <w:t xml:space="preserve"> </w:t>
+      </w:r>
+      <w:r>
+        <w:t xml:space="preserve">reported values only, before any filling, because a ratio built from filled values would contain</w:t>
+      </w:r>
+      <w:r>
+        <w:t xml:space="preserve"> </w:t>
+      </w:r>
+      <w:r>
+        <w:t xml:space="preserve">no new information. Infinite values, which come from a zero timber value, are treated as missing.</w:t>
+      </w:r>
+      <w:r>
+        <w:t xml:space="preserve"> </w:t>
+      </w:r>
+      <w:r>
+        <w:t xml:space="preserve">The gaps are then filled with the same averages.</w:t>
       </w:r>
     </w:p>
     <w:p>
@@ -5958,8 +6328,8 @@
         </w:tc>
       </w:tr>
     </w:tbl>
-    <w:bookmarkEnd w:id="25"/>
-    <w:bookmarkStart w:id="29" w:name="completed-unit-value-of-nai"/>
+    <w:bookmarkEnd w:id="27"/>
+    <w:bookmarkStart w:id="31" w:name="completed-unit-value-of-nai"/>
     <w:p>
       <w:pPr>
         <w:pStyle w:val="Heading2"/>
@@ -6651,18 +7021,18 @@
           <wp:inline>
             <wp:extent cx="5334000" cy="4148666"/>
             <wp:effectExtent b="0" l="0" r="0" t="0"/>
-            <wp:docPr descr="" title="" id="27" name="Picture"/>
+            <wp:docPr descr="" title="" id="29" name="Picture"/>
             <a:graphic>
               <a:graphicData uri="http://schemas.openxmlformats.org/drawingml/2006/picture">
                 <pic:pic>
                   <pic:nvPicPr>
-                    <pic:cNvPr descr="index_files/figure-docx/unit-value-chart-1.png" id="28" name="Picture"/>
+                    <pic:cNvPr descr="index_files/figure-docx/unit-value-chart-1.png" id="30" name="Picture"/>
                     <pic:cNvPicPr>
                       <a:picLocks noChangeArrowheads="1" noChangeAspect="1"/>
                     </pic:cNvPicPr>
                   </pic:nvPicPr>
                   <pic:blipFill>
-                    <a:blip r:embed="rId26"/>
+                    <a:blip r:embed="rId28"/>
                     <a:stretch>
                       <a:fillRect/>
                     </a:stretch>
@@ -6689,9 +7059,9 @@
         </w:drawing>
       </w:r>
     </w:p>
-    <w:bookmarkEnd w:id="29"/>
-    <w:bookmarkEnd w:id="30"/>
-    <w:bookmarkStart w:id="34" w:name="monetary-flow"/>
+    <w:bookmarkEnd w:id="31"/>
+    <w:bookmarkEnd w:id="32"/>
+    <w:bookmarkStart w:id="36" w:name="monetary-flow"/>
     <w:p>
       <w:pPr>
         <w:pStyle w:val="Heading1"/>
@@ -6700,7 +7070,7 @@
         <w:t xml:space="preserve">Monetary flow</w:t>
       </w:r>
     </w:p>
-    <w:bookmarkStart w:id="31" w:name="nominal-value"/>
+    <w:bookmarkStart w:id="33" w:name="nominal-value"/>
     <w:p>
       <w:pPr>
         <w:pStyle w:val="Heading2"/>
@@ -6929,8 +7299,8 @@
         <w:t xml:space="preserve">)</w:t>
       </w:r>
     </w:p>
-    <w:bookmarkEnd w:id="31"/>
-    <w:bookmarkStart w:id="32" w:name="constant-prices"/>
+    <w:bookmarkEnd w:id="33"/>
+    <w:bookmarkStart w:id="34" w:name="constant-prices"/>
     <w:p>
       <w:pPr>
         <w:pStyle w:val="Heading2"/>
@@ -6944,13 +7314,37 @@
         <w:pStyle w:val="FirstParagraph"/>
       </w:pPr>
       <w:r>
-        <w:t xml:space="preserve">The HICP index is rebased so that the base year equals 1, and each nominal value is multiplied</w:t>
-      </w:r>
-      <w:r>
-        <w:t xml:space="preserve"> </w:t>
-      </w:r>
-      <w:r>
-        <w:t xml:space="preserve">by the deflator of its year. The result is in million euro of the base year.</w:t>
+        <w:t xml:space="preserve">Prices rose between 2000 and 2024, so a euro in 2024 buys less than a euro in 2010. To compare</w:t>
+      </w:r>
+      <w:r>
+        <w:t xml:space="preserve"> </w:t>
+      </w:r>
+      <w:r>
+        <w:t xml:space="preserve">years, the HICP index is rebased so that the base year equals 1, and each nominal value is</w:t>
+      </w:r>
+      <w:r>
+        <w:t xml:space="preserve"> </w:t>
+      </w:r>
+      <w:r>
+        <w:t xml:space="preserve">multiplied by the deflator of its year. Deflators are above 1 before the base year, where prices were</w:t>
+      </w:r>
+      <w:r>
+        <w:t xml:space="preserve"> </w:t>
+      </w:r>
+      <w:r>
+        <w:t xml:space="preserve">lower, and below 1 after it. The result is in million euro of the base year. The same index is used</w:t>
+      </w:r>
+      <w:r>
+        <w:t xml:space="preserve"> </w:t>
+      </w:r>
+      <w:r>
+        <w:t xml:space="preserve">for all countries, because the question is how the general price level moved and not how timber</w:t>
+      </w:r>
+      <w:r>
+        <w:t xml:space="preserve"> </w:t>
+      </w:r>
+      <w:r>
+        <w:t xml:space="preserve">prices moved.</w:t>
       </w:r>
     </w:p>
     <w:p>
@@ -7992,8 +8386,8 @@
         </w:tc>
       </w:tr>
     </w:tbl>
-    <w:bookmarkEnd w:id="32"/>
-    <w:bookmarkStart w:id="33" w:name="eu-totals"/>
+    <w:bookmarkEnd w:id="34"/>
+    <w:bookmarkStart w:id="35" w:name="eu-totals"/>
     <w:p>
       <w:pPr>
         <w:pStyle w:val="Heading2"/>
@@ -9763,9 +10157,9 @@
         </w:tc>
       </w:tr>
     </w:tbl>
-    <w:bookmarkEnd w:id="33"/>
-    <w:bookmarkEnd w:id="34"/>
-    <w:bookmarkStart w:id="40" w:name="spatial-component"/>
+    <w:bookmarkEnd w:id="35"/>
+    <w:bookmarkEnd w:id="36"/>
+    <w:bookmarkStart w:id="42" w:name="spatial-component"/>
     <w:p>
       <w:pPr>
         <w:pStyle w:val="Heading1"/>
@@ -10490,7 +10884,7 @@
         <w:t xml:space="preserve">}</w:t>
       </w:r>
     </w:p>
-    <w:bookmarkStart w:id="35" w:name="conservation-check"/>
+    <w:bookmarkStart w:id="37" w:name="conservation-check"/>
     <w:p>
       <w:pPr>
         <w:pStyle w:val="Heading2"/>
@@ -12510,8 +12904,8 @@
         </w:tc>
       </w:tr>
     </w:tbl>
-    <w:bookmarkEnd w:id="35"/>
-    <w:bookmarkStart w:id="39" w:name="maps"/>
+    <w:bookmarkEnd w:id="37"/>
+    <w:bookmarkStart w:id="41" w:name="maps"/>
     <w:p>
       <w:pPr>
         <w:pStyle w:val="Heading2"/>
@@ -13511,18 +13905,18 @@
           <wp:inline>
             <wp:extent cx="5334000" cy="4267200"/>
             <wp:effectExtent b="0" l="0" r="0" t="0"/>
-            <wp:docPr descr="" title="" id="37" name="Picture"/>
+            <wp:docPr descr="" title="" id="39" name="Picture"/>
             <a:graphic>
               <a:graphicData uri="http://schemas.openxmlformats.org/drawingml/2006/picture">
                 <pic:pic>
                   <pic:nvPicPr>
-                    <pic:cNvPr descr="index_files/figure-docx/value-maps-1.png" id="38" name="Picture"/>
+                    <pic:cNvPr descr="index_files/figure-docx/value-maps-1.png" id="40" name="Picture"/>
                     <pic:cNvPicPr>
                       <a:picLocks noChangeArrowheads="1" noChangeAspect="1"/>
                     </pic:cNvPicPr>
                   </pic:nvPicPr>
                   <pic:blipFill>
-                    <a:blip r:embed="rId36"/>
+                    <a:blip r:embed="rId38"/>
                     <a:stretch>
                       <a:fillRect/>
                     </a:stretch>
@@ -13549,9 +13943,9 @@
         </w:drawing>
       </w:r>
     </w:p>
-    <w:bookmarkEnd w:id="39"/>
-    <w:bookmarkEnd w:id="40"/>
-    <w:bookmarkStart w:id="48" w:name="X8e24b68ac7a0b27f5da90d71b859a6580368683"/>
+    <w:bookmarkEnd w:id="41"/>
+    <w:bookmarkEnd w:id="42"/>
+    <w:bookmarkStart w:id="50" w:name="X8e24b68ac7a0b27f5da90d71b859a6580368683"/>
     <w:p>
       <w:pPr>
         <w:pStyle w:val="Heading1"/>
@@ -13601,18 +13995,18 @@
                 <wp:inline>
                   <wp:extent cx="152400" cy="152400"/>
                   <wp:effectExtent b="0" l="0" r="0" t="0"/>
-                  <wp:docPr descr="" title="" id="41" name="Picture"/>
+                  <wp:docPr descr="" title="" id="43" name="Picture"/>
                   <a:graphic>
                     <a:graphicData uri="http://schemas.openxmlformats.org/drawingml/2006/picture">
                       <pic:pic>
                         <pic:nvPicPr>
-                          <pic:cNvPr descr="/Applications/quarto/share/formats/docx/important.png" id="42" name="Picture"/>
+                          <pic:cNvPr descr="/Applications/quarto/share/formats/docx/important.png" id="44" name="Picture"/>
                           <pic:cNvPicPr>
                             <a:picLocks noChangeArrowheads="1" noChangeAspect="1"/>
                           </pic:cNvPicPr>
                         </pic:nvPicPr>
                         <pic:blipFill>
-                          <a:blip r:embed="rId10"/>
+                          <a:blip r:embed="rId11"/>
                           <a:stretch>
                             <a:fillRect/>
                           </a:stretch>
@@ -15040,7 +15434,7 @@
         <w:t xml:space="preserve">}</w:t>
       </w:r>
     </w:p>
-    <w:bookmarkStart w:id="43" w:name="conservation-check-1"/>
+    <w:bookmarkStart w:id="45" w:name="conservation-check-1"/>
     <w:p>
       <w:pPr>
         <w:pStyle w:val="Heading2"/>
@@ -17292,8 +17686,8 @@
         </w:tc>
       </w:tr>
     </w:tbl>
-    <w:bookmarkEnd w:id="43"/>
-    <w:bookmarkStart w:id="47" w:name="comparison-with-the-baseline"/>
+    <w:bookmarkEnd w:id="45"/>
+    <w:bookmarkStart w:id="49" w:name="comparison-with-the-baseline"/>
     <w:p>
       <w:pPr>
         <w:pStyle w:val="Heading2"/>
@@ -20501,18 +20895,18 @@
           <wp:inline>
             <wp:extent cx="5334000" cy="5334000"/>
             <wp:effectExtent b="0" l="0" r="0" t="0"/>
-            <wp:docPr descr="" title="" id="45" name="Picture"/>
+            <wp:docPr descr="" title="" id="47" name="Picture"/>
             <a:graphic>
               <a:graphicData uri="http://schemas.openxmlformats.org/drawingml/2006/picture">
                 <pic:pic>
                   <pic:nvPicPr>
-                    <pic:cNvPr descr="index_files/figure-docx/clc-difference-map-1.png" id="46" name="Picture"/>
+                    <pic:cNvPr descr="index_files/figure-docx/clc-difference-map-1.png" id="48" name="Picture"/>
                     <pic:cNvPicPr>
                       <a:picLocks noChangeArrowheads="1" noChangeAspect="1"/>
                     </pic:cNvPicPr>
                   </pic:nvPicPr>
                   <pic:blipFill>
-                    <a:blip r:embed="rId44"/>
+                    <a:blip r:embed="rId46"/>
                     <a:stretch>
                       <a:fillRect/>
                     </a:stretch>
@@ -20690,9 +21084,9 @@
         <w:t xml:space="preserve">)</w:t>
       </w:r>
     </w:p>
-    <w:bookmarkEnd w:id="47"/>
-    <w:bookmarkEnd w:id="48"/>
-    <w:bookmarkStart w:id="49" w:name="exports"/>
+    <w:bookmarkEnd w:id="49"/>
+    <w:bookmarkEnd w:id="50"/>
+    <w:bookmarkStart w:id="51" w:name="exports"/>
     <w:p>
       <w:pPr>
         <w:pStyle w:val="Heading1"/>
@@ -21390,8 +21784,8 @@
         <w:t xml:space="preserve">)</w:t>
       </w:r>
     </w:p>
-    <w:bookmarkEnd w:id="49"/>
-    <w:bookmarkStart w:id="50" w:name="downloads"/>
+    <w:bookmarkEnd w:id="51"/>
+    <w:bookmarkStart w:id="52" w:name="downloads"/>
     <w:p>
       <w:pPr>
         <w:pStyle w:val="Heading1"/>
@@ -24268,8 +24662,8 @@
         </w:tc>
       </w:tr>
     </w:tbl>
-    <w:bookmarkEnd w:id="50"/>
-    <w:bookmarkStart w:id="51" w:name="limitations"/>
+    <w:bookmarkEnd w:id="52"/>
+    <w:bookmarkStart w:id="53" w:name="limitations"/>
     <w:p>
       <w:pPr>
         <w:pStyle w:val="Heading1"/>
@@ -24389,8 +24783,8 @@
         <w:t xml:space="preserve">Corine refinement adds change over time, with the limits discussed in the physical document.</w:t>
       </w:r>
     </w:p>
-    <w:bookmarkEnd w:id="51"/>
-    <w:bookmarkStart w:id="60" w:name="references"/>
+    <w:bookmarkEnd w:id="53"/>
+    <w:bookmarkStart w:id="62" w:name="references"/>
     <w:p>
       <w:pPr>
         <w:pStyle w:val="Heading1"/>
@@ -24399,8 +24793,8 @@
         <w:t xml:space="preserve">References</w:t>
       </w:r>
     </w:p>
-    <w:bookmarkStart w:id="59" w:name="refs"/>
-    <w:bookmarkStart w:id="53" w:name="ref-eurostat2026hicp"/>
+    <w:bookmarkStart w:id="61" w:name="refs"/>
+    <w:bookmarkStart w:id="55" w:name="ref-eurostat2026hicp"/>
     <w:p>
       <w:pPr>
         <w:pStyle w:val="Bibliography"/>
@@ -24424,7 +24818,7 @@
       <w:r>
         <w:t xml:space="preserve"> </w:t>
       </w:r>
-      <w:hyperlink r:id="rId52">
+      <w:hyperlink r:id="rId54">
         <w:r>
           <w:rPr>
             <w:rStyle w:val="Hyperlink"/>
@@ -24433,8 +24827,8 @@
         </w:r>
       </w:hyperlink>
     </w:p>
-    <w:bookmarkEnd w:id="53"/>
-    <w:bookmarkStart w:id="55" w:name="ref-eurostat2026forbasic"/>
+    <w:bookmarkEnd w:id="55"/>
+    <w:bookmarkStart w:id="57" w:name="ref-eurostat2026forbasic"/>
     <w:p>
       <w:pPr>
         <w:pStyle w:val="Bibliography"/>
@@ -24458,7 +24852,7 @@
       <w:r>
         <w:t xml:space="preserve"> </w:t>
       </w:r>
-      <w:hyperlink r:id="rId54">
+      <w:hyperlink r:id="rId56">
         <w:r>
           <w:rPr>
             <w:rStyle w:val="Hyperlink"/>
@@ -24467,8 +24861,8 @@
         </w:r>
       </w:hyperlink>
     </w:p>
-    <w:bookmarkEnd w:id="55"/>
-    <w:bookmarkStart w:id="57" w:name="ref-eurostat2026forsupcp"/>
+    <w:bookmarkEnd w:id="57"/>
+    <w:bookmarkStart w:id="59" w:name="ref-eurostat2026forsupcp"/>
     <w:p>
       <w:pPr>
         <w:pStyle w:val="Bibliography"/>
@@ -24492,7 +24886,7 @@
       <w:r>
         <w:t xml:space="preserve"> </w:t>
       </w:r>
-      <w:hyperlink r:id="rId56">
+      <w:hyperlink r:id="rId58">
         <w:r>
           <w:rPr>
             <w:rStyle w:val="Hyperlink"/>
@@ -24501,8 +24895,8 @@
         </w:r>
       </w:hyperlink>
     </w:p>
-    <w:bookmarkEnd w:id="57"/>
-    <w:bookmarkStart w:id="58" w:name="ref-lanotte2021"/>
+    <w:bookmarkEnd w:id="59"/>
+    <w:bookmarkStart w:id="60" w:name="ref-lanotte2021"/>
     <w:p>
       <w:pPr>
         <w:pStyle w:val="Bibliography"/>
@@ -24527,9 +24921,9 @@
         <w:t xml:space="preserve">(No. EUR 30856 EN, JRC126566). Publications Office of the European Union.</w:t>
       </w:r>
     </w:p>
-    <w:bookmarkEnd w:id="58"/>
-    <w:bookmarkEnd w:id="59"/>
     <w:bookmarkEnd w:id="60"/>
+    <w:bookmarkEnd w:id="61"/>
+    <w:bookmarkEnd w:id="62"/>
     <w:sectPr>
       <w:footnotePr>
         <w:numRestart w:val="eachSect"/>

</xml_diff>

<commit_message>
Added NUTS tables to Excel outputs
</commit_message>
<xml_diff>
--- a/docs/documentation/methods/monetary-valuation/index.docx
+++ b/docs/documentation/methods/monetary-valuation/index.docx
@@ -58,13 +58,10 @@
         <w:pStyle w:val="FirstParagraph"/>
       </w:pPr>
       <w:r>
-        <w:t xml:space="preserve">This page is the second phase of the wood provision update. The first phase</w:t>
-      </w:r>
-      <w:r>
-        <w:t xml:space="preserve"> </w:t>
-      </w:r>
-      <w:r>
-        <w:t xml:space="preserve">(</w:t>
+        <w:t xml:space="preserve">This page continues the wood provision update. The</w:t>
+      </w:r>
+      <w:r>
+        <w:t xml:space="preserve"> </w:t>
       </w:r>
       <w:hyperlink r:id="rId9">
         <w:r>
@@ -75,7 +72,10 @@
         </w:r>
       </w:hyperlink>
       <w:r>
-        <w:t xml:space="preserve">) produced the net annual increment (NAI) of forest</w:t>
+        <w:t xml:space="preserve"> </w:t>
+      </w:r>
+      <w:r>
+        <w:t xml:space="preserve">produced the net annual increment (NAI) of forest</w:t>
       </w:r>
       <w:r>
         <w:t xml:space="preserve"> </w:t>
@@ -293,7 +293,7 @@
         <w:pStyle w:val="FirstParagraph"/>
       </w:pPr>
       <w:r>
-        <w:t xml:space="preserve">The physical flow is not recomputed here. The page reads the tables that the first phase</w:t>
+        <w:t xml:space="preserve">The physical flow is not recomputed here. The page reads the tables that the physical accounts</w:t>
       </w:r>
       <w:r>
         <w:t xml:space="preserve"> </w:t>
@@ -928,13 +928,13 @@
               <w:t xml:space="preserve"> </w:t>
             </w:r>
             <w:r>
-              <w:t xml:space="preserve">in the parameters chunk. It is set to 2010, the base year of the fish provision</w:t>
+              <w:t xml:space="preserve">in the parameters chunk. It is set to 2010 so that this service shares one price level</w:t>
             </w:r>
             <w:r>
               <w:t xml:space="preserve"> </w:t>
             </w:r>
             <w:r>
-              <w:t xml:space="preserve">accounts, so that the services share one price level and can be added or compared (the INCA plugin</w:t>
+              <w:t xml:space="preserve">with the other ecosystem service accounts and can be added to or compared with them (the INCA plugin</w:t>
             </w:r>
             <w:r>
               <w:t xml:space="preserve"> </w:t>
@@ -1169,6 +1169,57 @@
         </w:rPr>
         <w:t xml:space="preserve">)</w:t>
       </w:r>
+      <w:r>
+        <w:br/>
+      </w:r>
+      <w:r>
+        <w:rPr>
+          <w:rStyle w:val="FunctionTok"/>
+        </w:rPr>
+        <w:t xml:space="preserve">source</w:t>
+      </w:r>
+      <w:r>
+        <w:rPr>
+          <w:rStyle w:val="NormalTok"/>
+        </w:rPr>
+        <w:t xml:space="preserve">(</w:t>
+      </w:r>
+      <w:r>
+        <w:rPr>
+          <w:rStyle w:val="StringTok"/>
+        </w:rPr>
+        <w:t xml:space="preserve">"scripts/helpers_results.R"</w:t>
+      </w:r>
+      <w:r>
+        <w:rPr>
+          <w:rStyle w:val="NormalTok"/>
+        </w:rPr>
+        <w:t xml:space="preserve">, </w:t>
+      </w:r>
+      <w:r>
+        <w:rPr>
+          <w:rStyle w:val="AttributeTok"/>
+        </w:rPr>
+        <w:t xml:space="preserve">encoding =</w:t>
+      </w:r>
+      <w:r>
+        <w:rPr>
+          <w:rStyle w:val="NormalTok"/>
+        </w:rPr>
+        <w:t xml:space="preserve"> </w:t>
+      </w:r>
+      <w:r>
+        <w:rPr>
+          <w:rStyle w:val="StringTok"/>
+        </w:rPr>
+        <w:t xml:space="preserve">"UTF-8"</w:t>
+      </w:r>
+      <w:r>
+        <w:rPr>
+          <w:rStyle w:val="NormalTok"/>
+        </w:rPr>
+        <w:t xml:space="preserve">)</w:t>
+      </w:r>
     </w:p>
     <w:bookmarkEnd w:id="19"/>
     <w:bookmarkStart w:id="20" w:name="parameters"/>
@@ -1512,6 +1563,60 @@
           <w:rStyle w:val="StringTok"/>
         </w:rPr>
         <w:t xml:space="preserve">"data/outputs/results/wood_nai_faws_country_year.rds"</w:t>
+      </w:r>
+      <w:r>
+        <w:br/>
+      </w:r>
+      <w:r>
+        <w:rPr>
+          <w:rStyle w:val="NormalTok"/>
+        </w:rPr>
+        <w:t xml:space="preserve">overuse_file </w:t>
+      </w:r>
+      <w:r>
+        <w:rPr>
+          <w:rStyle w:val="OtherTok"/>
+        </w:rPr>
+        <w:t xml:space="preserve">&lt;-</w:t>
+      </w:r>
+      <w:r>
+        <w:rPr>
+          <w:rStyle w:val="NormalTok"/>
+        </w:rPr>
+        <w:t xml:space="preserve"> </w:t>
+      </w:r>
+      <w:r>
+        <w:rPr>
+          <w:rStyle w:val="StringTok"/>
+        </w:rPr>
+        <w:t xml:space="preserve">"data/outputs/results/wood_overuse_country_year.rds"</w:t>
+      </w:r>
+      <w:r>
+        <w:br/>
+      </w:r>
+      <w:r>
+        <w:rPr>
+          <w:rStyle w:val="NormalTok"/>
+        </w:rPr>
+        <w:t xml:space="preserve">nuts_weights_file </w:t>
+      </w:r>
+      <w:r>
+        <w:rPr>
+          <w:rStyle w:val="OtherTok"/>
+        </w:rPr>
+        <w:t xml:space="preserve">&lt;-</w:t>
+      </w:r>
+      <w:r>
+        <w:rPr>
+          <w:rStyle w:val="NormalTok"/>
+        </w:rPr>
+        <w:t xml:space="preserve"> </w:t>
+      </w:r>
+      <w:r>
+        <w:rPr>
+          <w:rStyle w:val="StringTok"/>
+        </w:rPr>
+        <w:t xml:space="preserve">"data/inputs/faws/faws_weight_by_nuts.rds"</w:t>
       </w:r>
       <w:r>
         <w:br/>
@@ -21784,6 +21889,145 @@
         <w:t xml:space="preserve">)</w:t>
       </w:r>
     </w:p>
+    <w:p>
+      <w:pPr>
+        <w:pStyle w:val="FirstParagraph"/>
+      </w:pPr>
+      <w:r>
+        <w:t xml:space="preserve">The results workbook of the physical document is completed with the monetary tables of the actual</w:t>
+      </w:r>
+      <w:r>
+        <w:t xml:space="preserve"> </w:t>
+      </w:r>
+      <w:r>
+        <w:t xml:space="preserve">flow and of the overuse, for NUTS0, NUTS2 and NUTS3. The overuse is valued with the unit value of NAI of its country.</w:t>
+      </w:r>
+    </w:p>
+    <w:p>
+      <w:pPr>
+        <w:pStyle w:val="SourceCode"/>
+      </w:pPr>
+      <w:r>
+        <w:rPr>
+          <w:rStyle w:val="FunctionTok"/>
+        </w:rPr>
+        <w:t xml:space="preserve">write_results_workbook</w:t>
+      </w:r>
+      <w:r>
+        <w:rPr>
+          <w:rStyle w:val="NormalTok"/>
+        </w:rPr>
+        <w:t xml:space="preserve">(</w:t>
+      </w:r>
+      <w:r>
+        <w:br/>
+      </w:r>
+      <w:r>
+        <w:rPr>
+          <w:rStyle w:val="NormalTok"/>
+        </w:rPr>
+        <w:t xml:space="preserve">  </w:t>
+      </w:r>
+      <w:r>
+        <w:rPr>
+          <w:rStyle w:val="FunctionTok"/>
+        </w:rPr>
+        <w:t xml:space="preserve">readRDS</w:t>
+      </w:r>
+      <w:r>
+        <w:rPr>
+          <w:rStyle w:val="NormalTok"/>
+        </w:rPr>
+        <w:t xml:space="preserve">(overuse_file), </w:t>
+      </w:r>
+      <w:r>
+        <w:rPr>
+          <w:rStyle w:val="FunctionTok"/>
+        </w:rPr>
+        <w:t xml:space="preserve">readRDS</w:t>
+      </w:r>
+      <w:r>
+        <w:rPr>
+          <w:rStyle w:val="NormalTok"/>
+        </w:rPr>
+        <w:t xml:space="preserve">(nuts_weights_file), years_report, base_year,</w:t>
+      </w:r>
+      <w:r>
+        <w:br/>
+      </w:r>
+      <w:r>
+        <w:rPr>
+          <w:rStyle w:val="NormalTok"/>
+        </w:rPr>
+        <w:t xml:space="preserve">  </w:t>
+      </w:r>
+      <w:r>
+        <w:rPr>
+          <w:rStyle w:val="AttributeTok"/>
+        </w:rPr>
+        <w:t xml:space="preserve">path =</w:t>
+      </w:r>
+      <w:r>
+        <w:rPr>
+          <w:rStyle w:val="NormalTok"/>
+        </w:rPr>
+        <w:t xml:space="preserve"> </w:t>
+      </w:r>
+      <w:r>
+        <w:rPr>
+          <w:rStyle w:val="FunctionTok"/>
+        </w:rPr>
+        <w:t xml:space="preserve">file.path</w:t>
+      </w:r>
+      <w:r>
+        <w:rPr>
+          <w:rStyle w:val="NormalTok"/>
+        </w:rPr>
+        <w:t xml:space="preserve">(results_dir, </w:t>
+      </w:r>
+      <w:r>
+        <w:rPr>
+          <w:rStyle w:val="StringTok"/>
+        </w:rPr>
+        <w:t xml:space="preserve">"wood_provision_results.xlsx"</w:t>
+      </w:r>
+      <w:r>
+        <w:rPr>
+          <w:rStyle w:val="NormalTok"/>
+        </w:rPr>
+        <w:t xml:space="preserve">),</w:t>
+      </w:r>
+      <w:r>
+        <w:br/>
+      </w:r>
+      <w:r>
+        <w:rPr>
+          <w:rStyle w:val="NormalTok"/>
+        </w:rPr>
+        <w:t xml:space="preserve">  </w:t>
+      </w:r>
+      <w:r>
+        <w:rPr>
+          <w:rStyle w:val="AttributeTok"/>
+        </w:rPr>
+        <w:t xml:space="preserve">monetary =</w:t>
+      </w:r>
+      <w:r>
+        <w:rPr>
+          <w:rStyle w:val="NormalTok"/>
+        </w:rPr>
+        <w:t xml:space="preserve"> monetary_export</w:t>
+      </w:r>
+      <w:r>
+        <w:br/>
+      </w:r>
+      <w:r>
+        <w:rPr>
+          <w:rStyle w:val="NormalTok"/>
+        </w:rPr>
+        <w:t xml:space="preserve">)</w:t>
+      </w:r>
+    </w:p>
     <w:bookmarkEnd w:id="51"/>
     <w:bookmarkStart w:id="52" w:name="downloads"/>
     <w:p>
@@ -21935,6 +22179,27 @@
       </w:r>
       <w:r>
         <w:rPr>
+          <w:rStyle w:val="StringTok"/>
+        </w:rPr>
+        <w:t xml:space="preserve">"wood_provision_results.xlsx"</w:t>
+      </w:r>
+      <w:r>
+        <w:rPr>
+          <w:rStyle w:val="NormalTok"/>
+        </w:rPr>
+        <w:t xml:space="preserve">,</w:t>
+      </w:r>
+      <w:r>
+        <w:br/>
+      </w:r>
+      <w:r>
+        <w:rPr>
+          <w:rStyle w:val="NormalTok"/>
+        </w:rPr>
+        <w:t xml:space="preserve">    </w:t>
+      </w:r>
+      <w:r>
+        <w:rPr>
           <w:rStyle w:val="FunctionTok"/>
         </w:rPr>
         <w:t xml:space="preserve">sprintf</w:t>
@@ -22027,7 +22292,7 @@
         <w:rPr>
           <w:rStyle w:val="DecValTok"/>
         </w:rPr>
-        <w:t xml:space="preserve">3</w:t>
+        <w:t xml:space="preserve">4</w:t>
       </w:r>
       <w:r>
         <w:rPr>
@@ -22160,6 +22425,27 @@
           <w:rStyle w:val="StringTok"/>
         </w:rPr>
         <w:t xml:space="preserve">"Reporting-year table, deflator and parameters"</w:t>
+      </w:r>
+      <w:r>
+        <w:rPr>
+          <w:rStyle w:val="NormalTok"/>
+        </w:rPr>
+        <w:t xml:space="preserve">,</w:t>
+      </w:r>
+      <w:r>
+        <w:br/>
+      </w:r>
+      <w:r>
+        <w:rPr>
+          <w:rStyle w:val="NormalTok"/>
+        </w:rPr>
+        <w:t xml:space="preserve">    </w:t>
+      </w:r>
+      <w:r>
+        <w:rPr>
+          <w:rStyle w:val="StringTok"/>
+        </w:rPr>
+        <w:t xml:space="preserve">"Results tables for NUTS0, NUTS2 and NUTS3 in physical and monetary terms"</w:t>
       </w:r>
       <w:r>
         <w:rPr>
@@ -23392,6 +23678,121 @@
                 <w:color w:val="000000"/>
               </w:rPr>
               <w:t xml:space="preserve">Reporting-year table, deflator and parameters</w:t>
+            </w:r>
+          </w:p>
+        </w:tc>
+      </w:tr>
+      <w:tr>
+        <w:trPr>
+          <w:trHeight w:val="560" w:hRule="auto"/>
+        </w:trPr>
+        <w:tc>
+          <w:tcPr>
+            <w:tcBorders>
+              <w:bottom w:val="none" w:sz="0" w:space="0" w:color="000000"/>
+              <w:top w:val="none" w:sz="0" w:space="0" w:color="000000"/>
+              <w:left w:val="none" w:sz="0" w:space="0" w:color="000000"/>
+              <w:right w:val="none" w:sz="0" w:space="0" w:color="000000"/>
+            </w:tcBorders>
+            <w:shd w:val="clear" w:color="auto" w:fill="FFFFFF"/>
+            <w:tcMar>
+              <w:top w:w="0" w:type="dxa"/>
+              <w:bottom w:w="0" w:type="dxa"/>
+              <w:left w:w="0" w:type="dxa"/>
+              <w:right w:w="0" w:type="dxa"/>
+            </w:tcMar>
+            <w:vAlign w:val="center"/>
+          </w:tcPr>
+          <w:p>
+            <w:pPr>
+              <w:jc w:val="left"/>
+              <w:pBdr>
+                <w:bottom w:val="none" w:sz="0" w:space="0" w:color="000000"/>
+                <w:top w:val="none" w:sz="0" w:space="0" w:color="000000"/>
+                <w:left w:val="none" w:sz="0" w:space="0" w:color="000000"/>
+                <w:right w:val="none" w:sz="0" w:space="0" w:color="000000"/>
+              </w:pBdr>
+              <w:spacing w:after="100" w:before="100" w:line="240"/>
+              <w:ind w:left="100" w:right="100" w:firstLine="0" w:firstLineChars="0"/>
+              <w:rPr>
+                <w:rFonts w:ascii="Helvetica" w:hAnsi="Helvetica" w:eastAsia="Helvetica" w:cs="Helvetica"/>
+                <w:i w:val="false"/>
+                <w:b w:val="false"/>
+                <w:u w:val="none"/>
+                <w:strike w:val="false"/>
+                <w:sz w:val="18"/>
+                <w:szCs w:val="18"/>
+                <w:color w:val="000000"/>
+              </w:rPr>
+            </w:pPr>
+            <w:hyperlink r:id="../../../data/outputs/results/wood_provision_results.xlsx">
+              <w:r xmlns:w="http://schemas.openxmlformats.org/wordprocessingml/2006/main" xmlns:wp="http://schemas.openxmlformats.org/drawingml/2006/wordprocessingDrawing" xmlns:r="http://schemas.openxmlformats.org/officeDocument/2006/relationships" xmlns:w14="http://schemas.microsoft.com/office/word/2010/wordml">
+                <w:rPr>
+                  <w:rFonts w:ascii="Helvetica" w:hAnsi="Helvetica" w:eastAsia="Helvetica" w:cs="Helvetica"/>
+                  <w:i w:val="false"/>
+                  <w:b w:val="false"/>
+                  <w:u w:val="none"/>
+                  <w:strike w:val="false"/>
+                  <w:sz w:val="18"/>
+                  <w:szCs w:val="18"/>
+                  <w:color w:val="000000"/>
+                </w:rPr>
+                <w:t xml:space="preserve">wood_provision_results.xlsx</w:t>
+              </w:r>
+            </w:hyperlink>
+          </w:p>
+        </w:tc>
+        <w:tc>
+          <w:tcPr>
+            <w:tcBorders>
+              <w:bottom w:val="none" w:sz="0" w:space="0" w:color="000000"/>
+              <w:top w:val="none" w:sz="0" w:space="0" w:color="000000"/>
+              <w:left w:val="none" w:sz="0" w:space="0" w:color="000000"/>
+              <w:right w:val="none" w:sz="0" w:space="0" w:color="000000"/>
+            </w:tcBorders>
+            <w:shd w:val="clear" w:color="auto" w:fill="FFFFFF"/>
+            <w:tcMar>
+              <w:top w:w="0" w:type="dxa"/>
+              <w:bottom w:w="0" w:type="dxa"/>
+              <w:left w:w="0" w:type="dxa"/>
+              <w:right w:w="0" w:type="dxa"/>
+            </w:tcMar>
+            <w:vAlign w:val="center"/>
+          </w:tcPr>
+          <w:p>
+            <w:pPr>
+              <w:jc w:val="left"/>
+              <w:pBdr>
+                <w:bottom w:val="none" w:sz="0" w:space="0" w:color="000000"/>
+                <w:top w:val="none" w:sz="0" w:space="0" w:color="000000"/>
+                <w:left w:val="none" w:sz="0" w:space="0" w:color="000000"/>
+                <w:right w:val="none" w:sz="0" w:space="0" w:color="000000"/>
+              </w:pBdr>
+              <w:spacing w:after="100" w:before="100" w:line="240"/>
+              <w:ind w:left="100" w:right="100" w:firstLine="0" w:firstLineChars="0"/>
+              <w:rPr>
+                <w:rFonts w:ascii="Helvetica" w:hAnsi="Helvetica" w:eastAsia="Helvetica" w:cs="Helvetica"/>
+                <w:i w:val="false"/>
+                <w:b w:val="false"/>
+                <w:u w:val="none"/>
+                <w:strike w:val="false"/>
+                <w:sz w:val="18"/>
+                <w:szCs w:val="18"/>
+                <w:color w:val="000000"/>
+              </w:rPr>
+            </w:pPr>
+            <w:r xmlns:w="http://schemas.openxmlformats.org/wordprocessingml/2006/main" xmlns:wp="http://schemas.openxmlformats.org/drawingml/2006/wordprocessingDrawing" xmlns:r="http://schemas.openxmlformats.org/officeDocument/2006/relationships" xmlns:w14="http://schemas.microsoft.com/office/word/2010/wordml">
+              <w:rPr>
+                <w:rFonts w:ascii="Helvetica" w:hAnsi="Helvetica" w:eastAsia="Helvetica" w:cs="Helvetica"/>
+                <w:i w:val="false"/>
+                <w:b w:val="false"/>
+                <w:u w:val="none"/>
+                <w:strike w:val="false"/>
+                <w:sz w:val="18"/>
+                <w:szCs w:val="18"/>
+                <w:color w:val="000000"/>
+              </w:rPr>
+              <w:t xml:space="preserve">Results tables for NUTS0, NUTS2 and NUTS3 in physical and monetary terms</w:t>
             </w:r>
           </w:p>
         </w:tc>

</xml_diff>